<commit_message>
Am adăugat modelul conceptual în documentație
Am adăugat în punctul 3 al documentației și modelul conceptual
</commit_message>
<xml_diff>
--- a/Birle_Raluca_Proiect_BD.docx
+++ b/Birle_Raluca_Proiect_BD.docx
@@ -671,263 +671,17 @@
           <w:rFonts w:ascii="Times New Roman" w:hAnsi="Times New Roman" w:cs="Times New Roman"/>
         </w:rPr>
       </w:pPr>
-      <w:proofErr w:type="spellStart"/>
-      <w:r>
-        <w:rPr>
-          <w:rFonts w:ascii="Times New Roman" w:hAnsi="Times New Roman" w:cs="Times New Roman"/>
-        </w:rPr>
-        <w:t>Gestionarea</w:t>
-      </w:r>
-      <w:proofErr w:type="spellEnd"/>
-      <w:r>
-        <w:rPr>
-          <w:rFonts w:ascii="Times New Roman" w:hAnsi="Times New Roman" w:cs="Times New Roman"/>
-        </w:rPr>
-        <w:t xml:space="preserve"> </w:t>
-      </w:r>
-      <w:proofErr w:type="spellStart"/>
-      <w:r>
-        <w:rPr>
-          <w:rFonts w:ascii="Times New Roman" w:hAnsi="Times New Roman" w:cs="Times New Roman"/>
-        </w:rPr>
-        <w:t>spațiilor</w:t>
-      </w:r>
-      <w:proofErr w:type="spellEnd"/>
-      <w:r>
-        <w:rPr>
-          <w:rFonts w:ascii="Times New Roman" w:hAnsi="Times New Roman" w:cs="Times New Roman"/>
-        </w:rPr>
-        <w:t xml:space="preserve">: </w:t>
-      </w:r>
-      <w:proofErr w:type="spellStart"/>
-      <w:r>
-        <w:rPr>
-          <w:rFonts w:ascii="Times New Roman" w:hAnsi="Times New Roman" w:cs="Times New Roman"/>
-        </w:rPr>
-        <w:t>Absența</w:t>
-      </w:r>
-      <w:proofErr w:type="spellEnd"/>
-      <w:r>
-        <w:rPr>
-          <w:rFonts w:ascii="Times New Roman" w:hAnsi="Times New Roman" w:cs="Times New Roman"/>
-        </w:rPr>
-        <w:t xml:space="preserve"> </w:t>
-      </w:r>
-      <w:proofErr w:type="spellStart"/>
-      <w:r>
-        <w:rPr>
-          <w:rFonts w:ascii="Times New Roman" w:hAnsi="Times New Roman" w:cs="Times New Roman"/>
-        </w:rPr>
-        <w:t>unei</w:t>
-      </w:r>
-      <w:proofErr w:type="spellEnd"/>
-      <w:r>
-        <w:rPr>
-          <w:rFonts w:ascii="Times New Roman" w:hAnsi="Times New Roman" w:cs="Times New Roman"/>
-        </w:rPr>
-        <w:t xml:space="preserve"> </w:t>
-      </w:r>
-      <w:proofErr w:type="spellStart"/>
-      <w:r>
-        <w:rPr>
-          <w:rFonts w:ascii="Times New Roman" w:hAnsi="Times New Roman" w:cs="Times New Roman"/>
-        </w:rPr>
-        <w:t>evidențe</w:t>
-      </w:r>
-      <w:proofErr w:type="spellEnd"/>
-      <w:r>
-        <w:rPr>
-          <w:rFonts w:ascii="Times New Roman" w:hAnsi="Times New Roman" w:cs="Times New Roman"/>
-        </w:rPr>
-        <w:t xml:space="preserve"> concrete </w:t>
-      </w:r>
-      <w:proofErr w:type="spellStart"/>
-      <w:r>
-        <w:rPr>
-          <w:rFonts w:ascii="Times New Roman" w:hAnsi="Times New Roman" w:cs="Times New Roman"/>
-        </w:rPr>
-        <w:t>sau</w:t>
-      </w:r>
-      <w:proofErr w:type="spellEnd"/>
-      <w:r>
-        <w:rPr>
-          <w:rFonts w:ascii="Times New Roman" w:hAnsi="Times New Roman" w:cs="Times New Roman"/>
-        </w:rPr>
-        <w:t xml:space="preserve"> </w:t>
-      </w:r>
-      <w:proofErr w:type="spellStart"/>
-      <w:r>
-        <w:rPr>
-          <w:rFonts w:ascii="Times New Roman" w:hAnsi="Times New Roman" w:cs="Times New Roman"/>
-        </w:rPr>
-        <w:t>în</w:t>
-      </w:r>
-      <w:proofErr w:type="spellEnd"/>
-      <w:r>
-        <w:rPr>
-          <w:rFonts w:ascii="Times New Roman" w:hAnsi="Times New Roman" w:cs="Times New Roman"/>
-        </w:rPr>
-        <w:t xml:space="preserve"> </w:t>
-      </w:r>
-      <w:proofErr w:type="spellStart"/>
-      <w:r>
-        <w:rPr>
-          <w:rFonts w:ascii="Times New Roman" w:hAnsi="Times New Roman" w:cs="Times New Roman"/>
-        </w:rPr>
-        <w:t>timp</w:t>
-      </w:r>
-      <w:proofErr w:type="spellEnd"/>
-      <w:r>
-        <w:rPr>
-          <w:rFonts w:ascii="Times New Roman" w:hAnsi="Times New Roman" w:cs="Times New Roman"/>
-        </w:rPr>
-        <w:t xml:space="preserve"> real a</w:t>
-      </w:r>
-      <w:r>
-        <w:rPr>
-          <w:rFonts w:ascii="Times New Roman" w:hAnsi="Times New Roman" w:cs="Times New Roman"/>
-        </w:rPr>
-        <w:t xml:space="preserve"> </w:t>
-      </w:r>
-      <w:proofErr w:type="spellStart"/>
-      <w:r>
-        <w:rPr>
-          <w:rFonts w:ascii="Times New Roman" w:hAnsi="Times New Roman" w:cs="Times New Roman"/>
-        </w:rPr>
-        <w:t>cuștilor</w:t>
-      </w:r>
-      <w:proofErr w:type="spellEnd"/>
-      <w:r>
-        <w:rPr>
-          <w:rFonts w:ascii="Times New Roman" w:hAnsi="Times New Roman" w:cs="Times New Roman"/>
-        </w:rPr>
-        <w:t xml:space="preserve"> </w:t>
-      </w:r>
-      <w:proofErr w:type="spellStart"/>
-      <w:r>
-        <w:rPr>
-          <w:rFonts w:ascii="Times New Roman" w:hAnsi="Times New Roman" w:cs="Times New Roman"/>
-        </w:rPr>
-        <w:t>sau</w:t>
-      </w:r>
-      <w:proofErr w:type="spellEnd"/>
-      <w:r>
-        <w:rPr>
-          <w:rFonts w:ascii="Times New Roman" w:hAnsi="Times New Roman" w:cs="Times New Roman"/>
-        </w:rPr>
-        <w:t xml:space="preserve"> </w:t>
-      </w:r>
-      <w:proofErr w:type="spellStart"/>
-      <w:r>
-        <w:rPr>
-          <w:rFonts w:ascii="Times New Roman" w:hAnsi="Times New Roman" w:cs="Times New Roman"/>
-        </w:rPr>
-        <w:t>sectoarelor</w:t>
-      </w:r>
-      <w:proofErr w:type="spellEnd"/>
-      <w:r>
-        <w:rPr>
-          <w:rFonts w:ascii="Times New Roman" w:hAnsi="Times New Roman" w:cs="Times New Roman"/>
-        </w:rPr>
-        <w:t xml:space="preserve"> </w:t>
-      </w:r>
-      <w:proofErr w:type="spellStart"/>
-      <w:r>
-        <w:rPr>
-          <w:rFonts w:ascii="Times New Roman" w:hAnsi="Times New Roman" w:cs="Times New Roman"/>
-        </w:rPr>
-        <w:t>ocupate</w:t>
-      </w:r>
-      <w:proofErr w:type="spellEnd"/>
-      <w:r>
-        <w:rPr>
-          <w:rFonts w:ascii="Times New Roman" w:hAnsi="Times New Roman" w:cs="Times New Roman"/>
-        </w:rPr>
-        <w:t xml:space="preserve"> (sector </w:t>
-      </w:r>
-      <w:proofErr w:type="spellStart"/>
-      <w:r>
-        <w:rPr>
-          <w:rFonts w:ascii="Times New Roman" w:hAnsi="Times New Roman" w:cs="Times New Roman"/>
-        </w:rPr>
-        <w:t>câini</w:t>
-      </w:r>
-      <w:proofErr w:type="spellEnd"/>
-      <w:r>
-        <w:rPr>
-          <w:rFonts w:ascii="Times New Roman" w:hAnsi="Times New Roman" w:cs="Times New Roman"/>
-        </w:rPr>
-        <w:t xml:space="preserve">, sector </w:t>
-      </w:r>
-      <w:proofErr w:type="spellStart"/>
-      <w:r>
-        <w:rPr>
-          <w:rFonts w:ascii="Times New Roman" w:hAnsi="Times New Roman" w:cs="Times New Roman"/>
-        </w:rPr>
-        <w:t>pisici</w:t>
-      </w:r>
-      <w:proofErr w:type="spellEnd"/>
-      <w:r>
-        <w:rPr>
-          <w:rFonts w:ascii="Times New Roman" w:hAnsi="Times New Roman" w:cs="Times New Roman"/>
-        </w:rPr>
-        <w:t xml:space="preserve">, </w:t>
-      </w:r>
-      <w:proofErr w:type="spellStart"/>
-      <w:r>
-        <w:rPr>
-          <w:rFonts w:ascii="Times New Roman" w:hAnsi="Times New Roman" w:cs="Times New Roman"/>
-        </w:rPr>
-        <w:t>zonă</w:t>
-      </w:r>
-      <w:proofErr w:type="spellEnd"/>
-      <w:r>
-        <w:rPr>
-          <w:rFonts w:ascii="Times New Roman" w:hAnsi="Times New Roman" w:cs="Times New Roman"/>
-        </w:rPr>
-        <w:t xml:space="preserve"> de </w:t>
-      </w:r>
-      <w:proofErr w:type="spellStart"/>
-      <w:r>
-        <w:rPr>
-          <w:rFonts w:ascii="Times New Roman" w:hAnsi="Times New Roman" w:cs="Times New Roman"/>
-        </w:rPr>
-        <w:t>carantină</w:t>
-      </w:r>
-      <w:proofErr w:type="spellEnd"/>
-      <w:r>
-        <w:rPr>
-          <w:rFonts w:ascii="Times New Roman" w:hAnsi="Times New Roman" w:cs="Times New Roman"/>
-        </w:rPr>
-        <w:t xml:space="preserve">) duce la </w:t>
-      </w:r>
-      <w:proofErr w:type="spellStart"/>
-      <w:r>
-        <w:rPr>
-          <w:rFonts w:ascii="Times New Roman" w:hAnsi="Times New Roman" w:cs="Times New Roman"/>
-        </w:rPr>
-        <w:t>supraaglomerarea</w:t>
-      </w:r>
-      <w:proofErr w:type="spellEnd"/>
-      <w:r>
-        <w:rPr>
-          <w:rFonts w:ascii="Times New Roman" w:hAnsi="Times New Roman" w:cs="Times New Roman"/>
-        </w:rPr>
-        <w:t xml:space="preserve"> </w:t>
-      </w:r>
-      <w:proofErr w:type="spellStart"/>
-      <w:r>
-        <w:rPr>
-          <w:rFonts w:ascii="Times New Roman" w:hAnsi="Times New Roman" w:cs="Times New Roman"/>
-        </w:rPr>
-        <w:t>adăpostului</w:t>
-      </w:r>
-      <w:proofErr w:type="spellEnd"/>
-      <w:r>
-        <w:rPr>
-          <w:rFonts w:ascii="Times New Roman" w:hAnsi="Times New Roman" w:cs="Times New Roman"/>
-        </w:rPr>
-        <w:t>.</w:t>
+      <w:r>
+        <w:rPr>
+          <w:rFonts w:ascii="Times New Roman" w:hAnsi="Times New Roman" w:cs="Times New Roman"/>
+        </w:rPr>
+        <w:t>Gestionarea spațiilor: Absența unei evidențe concrete sau în timp real a</w:t>
+      </w:r>
+      <w:r>
+        <w:rPr>
+          <w:rFonts w:ascii="Times New Roman" w:hAnsi="Times New Roman" w:cs="Times New Roman"/>
+        </w:rPr>
+        <w:t xml:space="preserve"> cuștilor sau sectoarelor ocupate (sector câini, sector pisici, zonă de carantină) duce la supraaglomerarea adăpostului.</w:t>
       </w:r>
     </w:p>
     <w:p>
@@ -942,70 +696,18 @@
           <w:rFonts w:ascii="Times New Roman" w:hAnsi="Times New Roman" w:cs="Times New Roman"/>
         </w:rPr>
       </w:pPr>
-      <w:proofErr w:type="spellStart"/>
-      <w:r>
-        <w:rPr>
-          <w:rFonts w:ascii="Times New Roman" w:hAnsi="Times New Roman" w:cs="Times New Roman"/>
-        </w:rPr>
-        <w:t>Procesul</w:t>
-      </w:r>
-      <w:proofErr w:type="spellEnd"/>
-      <w:r>
-        <w:rPr>
-          <w:rFonts w:ascii="Times New Roman" w:hAnsi="Times New Roman" w:cs="Times New Roman"/>
-        </w:rPr>
-        <w:t xml:space="preserve"> </w:t>
-      </w:r>
-      <w:proofErr w:type="spellStart"/>
-      <w:r>
-        <w:rPr>
-          <w:rFonts w:ascii="Times New Roman" w:hAnsi="Times New Roman" w:cs="Times New Roman"/>
-        </w:rPr>
-        <w:t>anevoios</w:t>
-      </w:r>
-      <w:proofErr w:type="spellEnd"/>
-      <w:r>
-        <w:rPr>
-          <w:rFonts w:ascii="Times New Roman" w:hAnsi="Times New Roman" w:cs="Times New Roman"/>
-        </w:rPr>
-        <w:t xml:space="preserve"> de </w:t>
-      </w:r>
-      <w:proofErr w:type="spellStart"/>
-      <w:r>
-        <w:rPr>
-          <w:rFonts w:ascii="Times New Roman" w:hAnsi="Times New Roman" w:cs="Times New Roman"/>
-        </w:rPr>
-        <w:t>adopție</w:t>
-      </w:r>
-      <w:proofErr w:type="spellEnd"/>
-      <w:r>
-        <w:rPr>
-          <w:rFonts w:ascii="Times New Roman" w:hAnsi="Times New Roman" w:cs="Times New Roman"/>
-        </w:rPr>
-        <w:t>:</w:t>
-      </w:r>
-      <w:r>
-        <w:rPr>
-          <w:rFonts w:ascii="Times New Roman" w:hAnsi="Times New Roman" w:cs="Times New Roman"/>
-          <w:lang w:val="ro-RO"/>
-        </w:rPr>
-        <w:t xml:space="preserve"> Dificultatea de verificare a unui posibil </w:t>
-      </w:r>
-      <w:proofErr w:type="spellStart"/>
-      <w:r>
-        <w:rPr>
-          <w:rFonts w:ascii="Times New Roman" w:hAnsi="Times New Roman" w:cs="Times New Roman"/>
-          <w:lang w:val="ro-RO"/>
-        </w:rPr>
-        <w:t>adoptaptor</w:t>
-      </w:r>
-      <w:proofErr w:type="spellEnd"/>
-      <w:r>
-        <w:rPr>
-          <w:rFonts w:ascii="Times New Roman" w:hAnsi="Times New Roman" w:cs="Times New Roman"/>
-          <w:lang w:val="ro-RO"/>
-        </w:rPr>
-        <w:t xml:space="preserve"> cu privire la posibilele contracte de adopție anterioare sau a unor termeni specifici de respectat.</w:t>
+      <w:r>
+        <w:rPr>
+          <w:rFonts w:ascii="Times New Roman" w:hAnsi="Times New Roman" w:cs="Times New Roman"/>
+        </w:rPr>
+        <w:t>Procesul anevoios de adopție:</w:t>
+      </w:r>
+      <w:r>
+        <w:rPr>
+          <w:rFonts w:ascii="Times New Roman" w:hAnsi="Times New Roman" w:cs="Times New Roman"/>
+          <w:lang w:val="ro-RO"/>
+        </w:rPr>
+        <w:t xml:space="preserve"> Dificultatea de verificare a unui posibil adoptaptor cu privire la posibilele contracte de adopție anterioare sau a unor termeni specifici de respectat.</w:t>
       </w:r>
     </w:p>
     <w:p>
@@ -1093,350 +795,26 @@
           <w:rFonts w:ascii="Times New Roman" w:hAnsi="Times New Roman" w:cs="Times New Roman"/>
         </w:rPr>
       </w:pPr>
-      <w:proofErr w:type="spellStart"/>
-      <w:r>
-        <w:rPr>
-          <w:rFonts w:ascii="Times New Roman" w:hAnsi="Times New Roman" w:cs="Times New Roman"/>
-        </w:rPr>
-        <w:t>Utilitatea</w:t>
-      </w:r>
-      <w:proofErr w:type="spellEnd"/>
-      <w:r>
-        <w:rPr>
-          <w:rFonts w:ascii="Times New Roman" w:hAnsi="Times New Roman" w:cs="Times New Roman"/>
-        </w:rPr>
-        <w:t xml:space="preserve"> </w:t>
-      </w:r>
-      <w:proofErr w:type="spellStart"/>
-      <w:r>
-        <w:rPr>
-          <w:rFonts w:ascii="Times New Roman" w:hAnsi="Times New Roman" w:cs="Times New Roman"/>
-        </w:rPr>
-        <w:t>Practică</w:t>
-      </w:r>
-      <w:proofErr w:type="spellEnd"/>
-      <w:r>
-        <w:rPr>
-          <w:rFonts w:ascii="Times New Roman" w:hAnsi="Times New Roman" w:cs="Times New Roman"/>
-        </w:rPr>
-        <w:t xml:space="preserve"> a </w:t>
-      </w:r>
-      <w:proofErr w:type="spellStart"/>
-      <w:r>
-        <w:rPr>
-          <w:rFonts w:ascii="Times New Roman" w:hAnsi="Times New Roman" w:cs="Times New Roman"/>
-        </w:rPr>
-        <w:t>soluției</w:t>
-      </w:r>
-      <w:proofErr w:type="spellEnd"/>
-      <w:r>
-        <w:rPr>
-          <w:rFonts w:ascii="Times New Roman" w:hAnsi="Times New Roman" w:cs="Times New Roman"/>
-        </w:rPr>
-        <w:t xml:space="preserve"> </w:t>
-      </w:r>
-      <w:proofErr w:type="spellStart"/>
-      <w:r>
-        <w:rPr>
-          <w:rFonts w:ascii="Times New Roman" w:hAnsi="Times New Roman" w:cs="Times New Roman"/>
-        </w:rPr>
-        <w:t>propuse</w:t>
-      </w:r>
-      <w:proofErr w:type="spellEnd"/>
-    </w:p>
-    <w:p>
-      <w:pPr>
-        <w:spacing w:before="30" w:after="30"/>
-        <w:rPr>
-          <w:rFonts w:ascii="Times New Roman" w:hAnsi="Times New Roman" w:cs="Times New Roman"/>
-          <w:lang w:val="ro-RO"/>
-        </w:rPr>
-      </w:pPr>
-      <w:r>
-        <w:rPr>
-          <w:rFonts w:ascii="Times New Roman" w:hAnsi="Times New Roman" w:cs="Times New Roman"/>
-        </w:rPr>
-        <w:t xml:space="preserve">  </w:t>
-      </w:r>
-      <w:proofErr w:type="spellStart"/>
-      <w:r>
-        <w:rPr>
-          <w:rFonts w:ascii="Times New Roman" w:hAnsi="Times New Roman" w:cs="Times New Roman"/>
-        </w:rPr>
-        <w:t>Sistemul</w:t>
-      </w:r>
-      <w:proofErr w:type="spellEnd"/>
-      <w:r>
-        <w:rPr>
-          <w:rFonts w:ascii="Times New Roman" w:hAnsi="Times New Roman" w:cs="Times New Roman"/>
-        </w:rPr>
-        <w:t xml:space="preserve"> informatic se </w:t>
-      </w:r>
-      <w:proofErr w:type="spellStart"/>
-      <w:r>
-        <w:rPr>
-          <w:rFonts w:ascii="Times New Roman" w:hAnsi="Times New Roman" w:cs="Times New Roman"/>
-        </w:rPr>
-        <w:t>bazează</w:t>
-      </w:r>
-      <w:proofErr w:type="spellEnd"/>
-      <w:r>
-        <w:rPr>
-          <w:rFonts w:ascii="Times New Roman" w:hAnsi="Times New Roman" w:cs="Times New Roman"/>
-        </w:rPr>
-        <w:t xml:space="preserve"> pe un server de date MySQL </w:t>
-      </w:r>
-      <w:proofErr w:type="spellStart"/>
-      <w:r>
-        <w:rPr>
-          <w:rFonts w:ascii="Times New Roman" w:hAnsi="Times New Roman" w:cs="Times New Roman"/>
-        </w:rPr>
-        <w:t>și</w:t>
-      </w:r>
-      <w:proofErr w:type="spellEnd"/>
-      <w:r>
-        <w:rPr>
-          <w:rFonts w:ascii="Times New Roman" w:hAnsi="Times New Roman" w:cs="Times New Roman"/>
-        </w:rPr>
-        <w:t xml:space="preserve"> o </w:t>
-      </w:r>
-      <w:proofErr w:type="spellStart"/>
-      <w:r>
-        <w:rPr>
-          <w:rFonts w:ascii="Times New Roman" w:hAnsi="Times New Roman" w:cs="Times New Roman"/>
-        </w:rPr>
-        <w:t>aplicație</w:t>
-      </w:r>
-      <w:proofErr w:type="spellEnd"/>
-      <w:r>
-        <w:rPr>
-          <w:rFonts w:ascii="Times New Roman" w:hAnsi="Times New Roman" w:cs="Times New Roman"/>
-        </w:rPr>
-        <w:t xml:space="preserve"> de </w:t>
-      </w:r>
-      <w:proofErr w:type="spellStart"/>
-      <w:r>
-        <w:rPr>
-          <w:rFonts w:ascii="Times New Roman" w:hAnsi="Times New Roman" w:cs="Times New Roman"/>
-        </w:rPr>
-        <w:t>gestiune</w:t>
-      </w:r>
-      <w:proofErr w:type="spellEnd"/>
-      <w:r>
-        <w:rPr>
-          <w:rFonts w:ascii="Times New Roman" w:hAnsi="Times New Roman" w:cs="Times New Roman"/>
-        </w:rPr>
-        <w:t xml:space="preserve"> , </w:t>
-      </w:r>
-      <w:proofErr w:type="spellStart"/>
-      <w:r>
-        <w:rPr>
-          <w:rFonts w:ascii="Times New Roman" w:hAnsi="Times New Roman" w:cs="Times New Roman"/>
-        </w:rPr>
-        <w:t>rezolvând</w:t>
-      </w:r>
-      <w:proofErr w:type="spellEnd"/>
-      <w:r>
-        <w:rPr>
-          <w:rFonts w:ascii="Times New Roman" w:hAnsi="Times New Roman" w:cs="Times New Roman"/>
-        </w:rPr>
-        <w:t xml:space="preserve"> </w:t>
-      </w:r>
-      <w:proofErr w:type="spellStart"/>
-      <w:r>
-        <w:rPr>
-          <w:rFonts w:ascii="Times New Roman" w:hAnsi="Times New Roman" w:cs="Times New Roman"/>
-        </w:rPr>
-        <w:t>aceste</w:t>
-      </w:r>
-      <w:proofErr w:type="spellEnd"/>
-      <w:r>
-        <w:rPr>
-          <w:rFonts w:ascii="Times New Roman" w:hAnsi="Times New Roman" w:cs="Times New Roman"/>
-        </w:rPr>
-        <w:t xml:space="preserve"> </w:t>
-      </w:r>
-      <w:proofErr w:type="spellStart"/>
-      <w:r>
-        <w:rPr>
-          <w:rFonts w:ascii="Times New Roman" w:hAnsi="Times New Roman" w:cs="Times New Roman"/>
-        </w:rPr>
-        <w:t>probleme</w:t>
-      </w:r>
-      <w:proofErr w:type="spellEnd"/>
-      <w:r>
-        <w:rPr>
-          <w:rFonts w:ascii="Times New Roman" w:hAnsi="Times New Roman" w:cs="Times New Roman"/>
-        </w:rPr>
-        <w:t xml:space="preserve"> </w:t>
-      </w:r>
-      <w:proofErr w:type="spellStart"/>
-      <w:r>
-        <w:rPr>
-          <w:rFonts w:ascii="Times New Roman" w:hAnsi="Times New Roman" w:cs="Times New Roman"/>
-        </w:rPr>
-        <w:t>prin</w:t>
-      </w:r>
-      <w:proofErr w:type="spellEnd"/>
-      <w:r>
-        <w:rPr>
-          <w:rFonts w:ascii="Times New Roman" w:hAnsi="Times New Roman" w:cs="Times New Roman"/>
-        </w:rPr>
-        <w:t xml:space="preserve"> </w:t>
-      </w:r>
-      <w:proofErr w:type="spellStart"/>
-      <w:r>
-        <w:rPr>
-          <w:rFonts w:ascii="Times New Roman" w:hAnsi="Times New Roman" w:cs="Times New Roman"/>
-        </w:rPr>
-        <w:t>centralizarea</w:t>
-      </w:r>
-      <w:proofErr w:type="spellEnd"/>
-      <w:r>
-        <w:rPr>
-          <w:rFonts w:ascii="Times New Roman" w:hAnsi="Times New Roman" w:cs="Times New Roman"/>
-        </w:rPr>
-        <w:t xml:space="preserve"> </w:t>
-      </w:r>
-      <w:proofErr w:type="spellStart"/>
-      <w:r>
-        <w:rPr>
-          <w:rFonts w:ascii="Times New Roman" w:hAnsi="Times New Roman" w:cs="Times New Roman"/>
-        </w:rPr>
-        <w:t>și</w:t>
-      </w:r>
-      <w:proofErr w:type="spellEnd"/>
-      <w:r>
-        <w:rPr>
-          <w:rFonts w:ascii="Times New Roman" w:hAnsi="Times New Roman" w:cs="Times New Roman"/>
-        </w:rPr>
-        <w:t xml:space="preserve"> </w:t>
-      </w:r>
-      <w:proofErr w:type="spellStart"/>
-      <w:r>
-        <w:rPr>
-          <w:rFonts w:ascii="Times New Roman" w:hAnsi="Times New Roman" w:cs="Times New Roman"/>
-        </w:rPr>
-        <w:t>securizarea</w:t>
-      </w:r>
-      <w:proofErr w:type="spellEnd"/>
-      <w:r>
-        <w:rPr>
-          <w:rFonts w:ascii="Times New Roman" w:hAnsi="Times New Roman" w:cs="Times New Roman"/>
-        </w:rPr>
-        <w:t xml:space="preserve"> </w:t>
-      </w:r>
-      <w:proofErr w:type="spellStart"/>
-      <w:r>
-        <w:rPr>
-          <w:rFonts w:ascii="Times New Roman" w:hAnsi="Times New Roman" w:cs="Times New Roman"/>
-        </w:rPr>
-        <w:t>datelor</w:t>
-      </w:r>
-      <w:proofErr w:type="spellEnd"/>
-      <w:r>
-        <w:rPr>
-          <w:rFonts w:ascii="Times New Roman" w:hAnsi="Times New Roman" w:cs="Times New Roman"/>
-        </w:rPr>
-        <w:t xml:space="preserve">. </w:t>
-      </w:r>
-      <w:proofErr w:type="spellStart"/>
-      <w:r>
-        <w:rPr>
-          <w:rFonts w:ascii="Times New Roman" w:hAnsi="Times New Roman" w:cs="Times New Roman"/>
-        </w:rPr>
-        <w:t>Utilitatea</w:t>
-      </w:r>
-      <w:proofErr w:type="spellEnd"/>
-      <w:r>
-        <w:rPr>
-          <w:rFonts w:ascii="Times New Roman" w:hAnsi="Times New Roman" w:cs="Times New Roman"/>
-        </w:rPr>
-        <w:t xml:space="preserve"> </w:t>
-      </w:r>
-      <w:proofErr w:type="spellStart"/>
-      <w:r>
-        <w:rPr>
-          <w:rFonts w:ascii="Times New Roman" w:hAnsi="Times New Roman" w:cs="Times New Roman"/>
-        </w:rPr>
-        <w:t>practică</w:t>
-      </w:r>
-      <w:proofErr w:type="spellEnd"/>
-      <w:r>
-        <w:rPr>
-          <w:rFonts w:ascii="Times New Roman" w:hAnsi="Times New Roman" w:cs="Times New Roman"/>
-        </w:rPr>
-        <w:t xml:space="preserve"> </w:t>
-      </w:r>
-      <w:proofErr w:type="spellStart"/>
-      <w:r>
-        <w:rPr>
-          <w:rFonts w:ascii="Times New Roman" w:hAnsi="Times New Roman" w:cs="Times New Roman"/>
-        </w:rPr>
-        <w:t>devenind</w:t>
-      </w:r>
-      <w:proofErr w:type="spellEnd"/>
-      <w:r>
-        <w:rPr>
-          <w:rFonts w:ascii="Times New Roman" w:hAnsi="Times New Roman" w:cs="Times New Roman"/>
-        </w:rPr>
-        <w:t xml:space="preserve"> </w:t>
-      </w:r>
-      <w:proofErr w:type="spellStart"/>
-      <w:r>
-        <w:rPr>
-          <w:rFonts w:ascii="Times New Roman" w:hAnsi="Times New Roman" w:cs="Times New Roman"/>
-        </w:rPr>
-        <w:t>concretizată</w:t>
-      </w:r>
-      <w:proofErr w:type="spellEnd"/>
-      <w:r>
-        <w:rPr>
-          <w:rFonts w:ascii="Times New Roman" w:hAnsi="Times New Roman" w:cs="Times New Roman"/>
-        </w:rPr>
-        <w:t xml:space="preserve"> </w:t>
-      </w:r>
-      <w:proofErr w:type="spellStart"/>
-      <w:r>
-        <w:rPr>
-          <w:rFonts w:ascii="Times New Roman" w:hAnsi="Times New Roman" w:cs="Times New Roman"/>
-        </w:rPr>
-        <w:t>prin</w:t>
-      </w:r>
-      <w:proofErr w:type="spellEnd"/>
-      <w:r>
-        <w:rPr>
-          <w:rFonts w:ascii="Times New Roman" w:hAnsi="Times New Roman" w:cs="Times New Roman"/>
-        </w:rPr>
-        <w:t xml:space="preserve"> </w:t>
-      </w:r>
-      <w:proofErr w:type="spellStart"/>
-      <w:r>
-        <w:rPr>
-          <w:rFonts w:ascii="Times New Roman" w:hAnsi="Times New Roman" w:cs="Times New Roman"/>
-        </w:rPr>
-        <w:t>următorii</w:t>
-      </w:r>
-      <w:proofErr w:type="spellEnd"/>
-      <w:r>
-        <w:rPr>
-          <w:rFonts w:ascii="Times New Roman" w:hAnsi="Times New Roman" w:cs="Times New Roman"/>
-        </w:rPr>
-        <w:t xml:space="preserve"> </w:t>
-      </w:r>
-      <w:proofErr w:type="spellStart"/>
-      <w:r>
-        <w:rPr>
-          <w:rFonts w:ascii="Times New Roman" w:hAnsi="Times New Roman" w:cs="Times New Roman"/>
-        </w:rPr>
-        <w:t>factori</w:t>
-      </w:r>
-      <w:proofErr w:type="spellEnd"/>
-      <w:r>
-        <w:rPr>
-          <w:rFonts w:ascii="Times New Roman" w:hAnsi="Times New Roman" w:cs="Times New Roman"/>
-        </w:rPr>
-        <w:t>:</w:t>
+      <w:r>
+        <w:rPr>
+          <w:rFonts w:ascii="Times New Roman" w:hAnsi="Times New Roman" w:cs="Times New Roman"/>
+        </w:rPr>
+        <w:t>Utilitatea Practică a soluției propuse</w:t>
+      </w:r>
+    </w:p>
+    <w:p>
+      <w:pPr>
+        <w:spacing w:before="30" w:after="30"/>
+        <w:rPr>
+          <w:rFonts w:ascii="Times New Roman" w:hAnsi="Times New Roman" w:cs="Times New Roman"/>
+          <w:lang w:val="ro-RO"/>
+        </w:rPr>
+      </w:pPr>
+      <w:r>
+        <w:rPr>
+          <w:rFonts w:ascii="Times New Roman" w:hAnsi="Times New Roman" w:cs="Times New Roman"/>
+        </w:rPr>
+        <w:t xml:space="preserve">  Sistemul informatic se bazează pe un server de date MySQL și o aplicație de gestiune , rezolvând aceste probleme prin centralizarea și securizarea datelor. Utilitatea practică devenind concretizată prin următorii factori:</w:t>
       </w:r>
     </w:p>
     <w:p>
@@ -1914,53 +1292,12 @@
           <w:lang w:val="ro-RO"/>
         </w:rPr>
       </w:pPr>
-      <w:proofErr w:type="spellStart"/>
-      <w:r>
-        <w:rPr>
-          <w:rFonts w:ascii="Times New Roman" w:hAnsi="Times New Roman" w:cs="Times New Roman"/>
-          <w:lang w:val="ro-RO"/>
-        </w:rPr>
-        <w:t>Delete</w:t>
-      </w:r>
-      <w:proofErr w:type="spellEnd"/>
-      <w:r>
-        <w:rPr>
-          <w:rFonts w:ascii="Times New Roman" w:hAnsi="Times New Roman" w:cs="Times New Roman"/>
-          <w:lang w:val="ro-RO"/>
-        </w:rPr>
-        <w:t xml:space="preserve"> (Ștergere/Arhivare): Ștergerea înregistrărilor eronate sau arhivarea/eliminarea fișelor vechi (respectând constrângerile de integritate </w:t>
-      </w:r>
-      <w:proofErr w:type="spellStart"/>
-      <w:r>
-        <w:rPr>
-          <w:rFonts w:ascii="Times New Roman" w:hAnsi="Times New Roman" w:cs="Times New Roman"/>
-          <w:lang w:val="ro-RO"/>
-        </w:rPr>
-        <w:t>referențială</w:t>
-      </w:r>
-      <w:proofErr w:type="spellEnd"/>
-      <w:r>
-        <w:rPr>
-          <w:rFonts w:ascii="Times New Roman" w:hAnsi="Times New Roman" w:cs="Times New Roman"/>
-          <w:lang w:val="ro-RO"/>
-        </w:rPr>
-        <w:t xml:space="preserve"> din </w:t>
-      </w:r>
-      <w:proofErr w:type="spellStart"/>
-      <w:r>
-        <w:rPr>
-          <w:rFonts w:ascii="Times New Roman" w:hAnsi="Times New Roman" w:cs="Times New Roman"/>
-          <w:lang w:val="ro-RO"/>
-        </w:rPr>
-        <w:t>MySQL</w:t>
-      </w:r>
-      <w:proofErr w:type="spellEnd"/>
-      <w:r>
-        <w:rPr>
-          <w:rFonts w:ascii="Times New Roman" w:hAnsi="Times New Roman" w:cs="Times New Roman"/>
-          <w:lang w:val="ro-RO"/>
-        </w:rPr>
-        <w:t>).</w:t>
+      <w:r>
+        <w:rPr>
+          <w:rFonts w:ascii="Times New Roman" w:hAnsi="Times New Roman" w:cs="Times New Roman"/>
+          <w:lang w:val="ro-RO"/>
+        </w:rPr>
+        <w:t>Delete (Ștergere/Arhivare): Ștergerea înregistrărilor eronate sau arhivarea/eliminarea fișelor vechi (respectând constrângerile de integritate referențială din MySQL).</w:t>
       </w:r>
     </w:p>
     <w:p>
@@ -1976,21 +1313,12 @@
           <w:lang w:val="ro-RO"/>
         </w:rPr>
       </w:pPr>
-      <w:proofErr w:type="spellStart"/>
-      <w:r>
-        <w:rPr>
-          <w:rFonts w:ascii="Times New Roman" w:hAnsi="Times New Roman" w:cs="Times New Roman"/>
-          <w:lang w:val="ro-RO"/>
-        </w:rPr>
-        <w:t>Read</w:t>
-      </w:r>
-      <w:proofErr w:type="spellEnd"/>
-      <w:r>
-        <w:rPr>
-          <w:rFonts w:ascii="Times New Roman" w:hAnsi="Times New Roman" w:cs="Times New Roman"/>
-          <w:lang w:val="ro-RO"/>
-        </w:rPr>
-        <w:t xml:space="preserve"> (Consultare/Căutare): Vizualizarea tuturor animalelor disponibile pentru adopție, generarea fișei medicale a unui animal după numărul de microcip, căutarea unui adoptator după CNP.</w:t>
+      <w:r>
+        <w:rPr>
+          <w:rFonts w:ascii="Times New Roman" w:hAnsi="Times New Roman" w:cs="Times New Roman"/>
+          <w:lang w:val="ro-RO"/>
+        </w:rPr>
+        <w:t>Read (Consultare/Căutare): Vizualizarea tuturor animalelor disponibile pentru adopție, generarea fișei medicale a unui animal după numărul de microcip, căutarea unui adoptator după CNP.</w:t>
       </w:r>
     </w:p>
     <w:p>
@@ -2264,23 +1592,7 @@
           <w:rFonts w:ascii="Times New Roman" w:hAnsi="Times New Roman" w:cs="Times New Roman"/>
           <w:lang w:val="ro-RO"/>
         </w:rPr>
-        <w:t>Acces de citire (</w:t>
-      </w:r>
-      <w:proofErr w:type="spellStart"/>
-      <w:r>
-        <w:rPr>
-          <w:rFonts w:ascii="Times New Roman" w:hAnsi="Times New Roman" w:cs="Times New Roman"/>
-          <w:lang w:val="ro-RO"/>
-        </w:rPr>
-        <w:t>Read-Only</w:t>
-      </w:r>
-      <w:proofErr w:type="spellEnd"/>
-      <w:r>
-        <w:rPr>
-          <w:rFonts w:ascii="Times New Roman" w:hAnsi="Times New Roman" w:cs="Times New Roman"/>
-          <w:lang w:val="ro-RO"/>
-        </w:rPr>
-        <w:t>) pentru a consulta locația animalelor (cușcă/sector) și eventualele indicații speciale de hrană/comportament.</w:t>
+        <w:t>Acces de citire (Read-Only) pentru a consulta locația animalelor (cușcă/sector) și eventualele indicații speciale de hrană/comportament.</w:t>
       </w:r>
     </w:p>
     <w:p>
@@ -2334,6 +1646,16 @@
     <w:p>
       <w:pPr>
         <w:pStyle w:val="Listparagraf"/>
+        <w:spacing w:before="30" w:after="30"/>
+        <w:rPr>
+          <w:rFonts w:ascii="Times New Roman" w:hAnsi="Times New Roman" w:cs="Times New Roman"/>
+          <w:lang w:val="ro-RO"/>
+        </w:rPr>
+      </w:pPr>
+    </w:p>
+    <w:p>
+      <w:pPr>
+        <w:pStyle w:val="Listparagraf"/>
         <w:numPr>
           <w:ilvl w:val="1"/>
           <w:numId w:val="13"/>
@@ -2404,29 +1726,23 @@
       <w:r>
         <w:rPr>
           <w:rFonts w:ascii="Times New Roman" w:hAnsi="Times New Roman" w:cs="Times New Roman"/>
-          <w:lang w:val="ro-RO"/>
-        </w:rPr>
-        <w:t xml:space="preserve">Regula sectoarelor </w:t>
-      </w:r>
-      <w:r>
-        <w:rPr>
-          <w:rFonts w:ascii="Times New Roman" w:hAnsi="Times New Roman" w:cs="Times New Roman"/>
-        </w:rPr>
-        <w:t xml:space="preserve">: </w:t>
-      </w:r>
-      <w:proofErr w:type="spellStart"/>
-      <w:r>
-        <w:rPr>
-          <w:rFonts w:ascii="Times New Roman" w:hAnsi="Times New Roman" w:cs="Times New Roman"/>
-        </w:rPr>
-        <w:t>Fiecare</w:t>
-      </w:r>
-      <w:proofErr w:type="spellEnd"/>
-      <w:r>
-        <w:rPr>
-          <w:rFonts w:ascii="Times New Roman" w:hAnsi="Times New Roman" w:cs="Times New Roman"/>
-        </w:rPr>
-        <w:t xml:space="preserve"> sector </w:t>
+          <w:u w:val="single"/>
+          <w:lang w:val="ro-RO"/>
+        </w:rPr>
+        <w:t>Regula sectoarelor</w:t>
+      </w:r>
+      <w:r>
+        <w:rPr>
+          <w:rFonts w:ascii="Times New Roman" w:hAnsi="Times New Roman" w:cs="Times New Roman"/>
+          <w:lang w:val="ro-RO"/>
+        </w:rPr>
+        <w:t xml:space="preserve"> </w:t>
+      </w:r>
+      <w:r>
+        <w:rPr>
+          <w:rFonts w:ascii="Times New Roman" w:hAnsi="Times New Roman" w:cs="Times New Roman"/>
+        </w:rPr>
+        <w:t xml:space="preserve">: Fiecare sector </w:t>
       </w:r>
       <w:r>
         <w:rPr>
@@ -2465,6 +1781,7 @@
       <w:r>
         <w:rPr>
           <w:rFonts w:ascii="Times New Roman" w:hAnsi="Times New Roman" w:cs="Times New Roman"/>
+          <w:u w:val="single"/>
           <w:lang w:val="ro-RO"/>
         </w:rPr>
         <w:t>Regula identificării</w:t>
@@ -2513,6 +1830,7 @@
       <w:r>
         <w:rPr>
           <w:rFonts w:ascii="Times New Roman" w:hAnsi="Times New Roman" w:cs="Times New Roman"/>
+          <w:u w:val="single"/>
           <w:lang w:val="ro-RO"/>
         </w:rPr>
         <w:t>Regula st</w:t>
@@ -2520,9 +1838,17 @@
       <w:r>
         <w:rPr>
           <w:rFonts w:ascii="Times New Roman" w:hAnsi="Times New Roman" w:cs="Times New Roman"/>
-          <w:lang w:val="ro-RO"/>
-        </w:rPr>
-        <w:t xml:space="preserve">ării de sănătate </w:t>
+          <w:u w:val="single"/>
+          <w:lang w:val="ro-RO"/>
+        </w:rPr>
+        <w:t>ării de sănătate</w:t>
+      </w:r>
+      <w:r>
+        <w:rPr>
+          <w:rFonts w:ascii="Times New Roman" w:hAnsi="Times New Roman" w:cs="Times New Roman"/>
+          <w:lang w:val="ro-RO"/>
+        </w:rPr>
+        <w:t xml:space="preserve"> </w:t>
       </w:r>
       <w:r>
         <w:rPr>
@@ -2568,9 +1894,17 @@
       <w:r>
         <w:rPr>
           <w:rFonts w:ascii="Times New Roman" w:hAnsi="Times New Roman" w:cs="Times New Roman"/>
-          <w:lang w:val="ro-RO"/>
-        </w:rPr>
-        <w:t xml:space="preserve">Regula Adopției </w:t>
+          <w:u w:val="single"/>
+          <w:lang w:val="ro-RO"/>
+        </w:rPr>
+        <w:t>Regula Adopției</w:t>
+      </w:r>
+      <w:r>
+        <w:rPr>
+          <w:rFonts w:ascii="Times New Roman" w:hAnsi="Times New Roman" w:cs="Times New Roman"/>
+          <w:lang w:val="ro-RO"/>
+        </w:rPr>
+        <w:t xml:space="preserve"> </w:t>
       </w:r>
       <w:r>
         <w:rPr>
@@ -2605,6 +1939,417 @@
           <w:lang w:val="ro-RO"/>
         </w:rPr>
         <w:t xml:space="preserve">, acesta fiind identificat în bază prin CNP unic. </w:t>
+      </w:r>
+    </w:p>
+    <w:p>
+      <w:pPr>
+        <w:spacing w:before="30" w:after="30"/>
+        <w:ind w:left="540"/>
+        <w:rPr>
+          <w:rFonts w:ascii="Times New Roman" w:hAnsi="Times New Roman" w:cs="Times New Roman"/>
+          <w:lang w:val="ro-RO"/>
+        </w:rPr>
+      </w:pPr>
+    </w:p>
+    <w:p>
+      <w:pPr>
+        <w:pStyle w:val="Listparagraf"/>
+        <w:numPr>
+          <w:ilvl w:val="1"/>
+          <w:numId w:val="13"/>
+        </w:numPr>
+        <w:spacing w:before="30" w:after="30"/>
+        <w:rPr>
+          <w:rFonts w:ascii="Times New Roman" w:hAnsi="Times New Roman" w:cs="Times New Roman"/>
+          <w:lang w:val="ro-RO"/>
+        </w:rPr>
+      </w:pPr>
+      <w:r>
+        <w:rPr>
+          <w:rFonts w:ascii="Times New Roman" w:hAnsi="Times New Roman" w:cs="Times New Roman"/>
+          <w:lang w:val="ro-RO"/>
+        </w:rPr>
+        <w:t>Modelul conceptual</w:t>
+      </w:r>
+    </w:p>
+    <w:p>
+      <w:pPr>
+        <w:spacing w:before="30" w:after="30"/>
+        <w:rPr>
+          <w:rFonts w:ascii="Times New Roman" w:hAnsi="Times New Roman" w:cs="Times New Roman"/>
+          <w:lang w:val="ro-RO"/>
+        </w:rPr>
+      </w:pPr>
+      <w:r>
+        <w:rPr>
+          <w:rFonts w:ascii="Times New Roman" w:hAnsi="Times New Roman" w:cs="Times New Roman"/>
+          <w:lang w:val="ro-RO"/>
+        </w:rPr>
+        <w:t xml:space="preserve">ENTITĂȚI ȘI ATRIBUIE </w:t>
+      </w:r>
+      <w:r>
+        <w:rPr>
+          <w:rFonts w:ascii="Times New Roman" w:hAnsi="Times New Roman" w:cs="Times New Roman"/>
+        </w:rPr>
+        <w:t>:</w:t>
+      </w:r>
+    </w:p>
+    <w:p>
+      <w:pPr>
+        <w:pStyle w:val="Listparagraf"/>
+        <w:numPr>
+          <w:ilvl w:val="0"/>
+          <w:numId w:val="15"/>
+        </w:numPr>
+        <w:spacing w:before="30" w:after="30"/>
+        <w:rPr>
+          <w:rFonts w:ascii="Times New Roman" w:hAnsi="Times New Roman" w:cs="Times New Roman"/>
+          <w:lang w:val="ro-RO"/>
+        </w:rPr>
+      </w:pPr>
+      <w:r>
+        <w:rPr>
+          <w:rFonts w:ascii="Times New Roman" w:hAnsi="Times New Roman" w:cs="Times New Roman"/>
+          <w:lang w:val="ro-RO"/>
+        </w:rPr>
+        <w:t>Sectoare ( id_sector, denumire, capacitate_maximă )</w:t>
+      </w:r>
+    </w:p>
+    <w:p>
+      <w:pPr>
+        <w:pStyle w:val="Listparagraf"/>
+        <w:numPr>
+          <w:ilvl w:val="0"/>
+          <w:numId w:val="15"/>
+        </w:numPr>
+        <w:spacing w:before="30" w:after="30"/>
+        <w:rPr>
+          <w:rFonts w:ascii="Times New Roman" w:hAnsi="Times New Roman" w:cs="Times New Roman"/>
+          <w:lang w:val="ro-RO"/>
+        </w:rPr>
+      </w:pPr>
+      <w:r>
+        <w:rPr>
+          <w:rFonts w:ascii="Times New Roman" w:hAnsi="Times New Roman" w:cs="Times New Roman"/>
+          <w:lang w:val="ro-RO"/>
+        </w:rPr>
+        <w:t>Animale ( id_animal, nume, specie, rasă, vârstă_ani, sex, sterilizat, număr_microcip, status, id_sector )</w:t>
+      </w:r>
+    </w:p>
+    <w:p>
+      <w:pPr>
+        <w:pStyle w:val="Listparagraf"/>
+        <w:numPr>
+          <w:ilvl w:val="0"/>
+          <w:numId w:val="15"/>
+        </w:numPr>
+        <w:spacing w:before="30" w:after="30"/>
+        <w:rPr>
+          <w:rFonts w:ascii="Times New Roman" w:hAnsi="Times New Roman" w:cs="Times New Roman"/>
+          <w:lang w:val="ro-RO"/>
+        </w:rPr>
+      </w:pPr>
+      <w:r>
+        <w:rPr>
+          <w:rFonts w:ascii="Times New Roman" w:hAnsi="Times New Roman" w:cs="Times New Roman"/>
+          <w:lang w:val="ro-RO"/>
+        </w:rPr>
+        <w:t>Adoptatori ( id_adoptatori, nume, prenume, cnp, telefon, email, adresă )</w:t>
+      </w:r>
+    </w:p>
+    <w:p>
+      <w:pPr>
+        <w:pStyle w:val="Listparagraf"/>
+        <w:numPr>
+          <w:ilvl w:val="0"/>
+          <w:numId w:val="15"/>
+        </w:numPr>
+        <w:spacing w:before="30" w:after="30"/>
+        <w:rPr>
+          <w:rFonts w:ascii="Times New Roman" w:hAnsi="Times New Roman" w:cs="Times New Roman"/>
+          <w:lang w:val="ro-RO"/>
+        </w:rPr>
+      </w:pPr>
+      <w:r>
+        <w:rPr>
+          <w:rFonts w:ascii="Times New Roman" w:hAnsi="Times New Roman" w:cs="Times New Roman"/>
+          <w:lang w:val="ro-RO"/>
+        </w:rPr>
+        <w:t>Adopții ( id_adopție, id_animal, id_adoptator, data_adopție, număr_contract )</w:t>
+      </w:r>
+    </w:p>
+    <w:p>
+      <w:pPr>
+        <w:pStyle w:val="Listparagraf"/>
+        <w:numPr>
+          <w:ilvl w:val="0"/>
+          <w:numId w:val="15"/>
+        </w:numPr>
+        <w:spacing w:before="30" w:after="30"/>
+        <w:rPr>
+          <w:rFonts w:ascii="Times New Roman" w:hAnsi="Times New Roman" w:cs="Times New Roman"/>
+          <w:lang w:val="ro-RO"/>
+        </w:rPr>
+      </w:pPr>
+      <w:r>
+        <w:rPr>
+          <w:rFonts w:ascii="Times New Roman" w:hAnsi="Times New Roman" w:cs="Times New Roman"/>
+          <w:lang w:val="ro-RO"/>
+        </w:rPr>
+        <w:t xml:space="preserve">Fișe medicale ( id_fișă, id_animal, data_consultație, diagnostic, tratament, nume_veterinar ) </w:t>
+      </w:r>
+    </w:p>
+    <w:p>
+      <w:pPr>
+        <w:spacing w:before="30" w:after="30"/>
+        <w:ind w:left="360"/>
+        <w:rPr>
+          <w:rFonts w:ascii="Times New Roman" w:hAnsi="Times New Roman" w:cs="Times New Roman"/>
+          <w:lang w:val="ro-RO"/>
+        </w:rPr>
+      </w:pPr>
+    </w:p>
+    <w:p>
+      <w:pPr>
+        <w:spacing w:before="30" w:after="30"/>
+        <w:rPr>
+          <w:rFonts w:ascii="Times New Roman" w:hAnsi="Times New Roman" w:cs="Times New Roman"/>
+          <w:lang w:val="ro-RO"/>
+        </w:rPr>
+      </w:pPr>
+      <w:r>
+        <w:rPr>
+          <w:rFonts w:ascii="Times New Roman" w:hAnsi="Times New Roman" w:cs="Times New Roman"/>
+          <w:lang w:val="ro-RO"/>
+        </w:rPr>
+        <w:t>Relații între entități</w:t>
+      </w:r>
+      <w:r>
+        <w:rPr>
+          <w:rFonts w:ascii="Times New Roman" w:hAnsi="Times New Roman" w:cs="Times New Roman"/>
+        </w:rPr>
+        <w:t>:</w:t>
+      </w:r>
+      <w:r>
+        <w:rPr>
+          <w:rFonts w:ascii="Times New Roman" w:hAnsi="Times New Roman" w:cs="Times New Roman"/>
+          <w:lang w:val="ro-RO"/>
+        </w:rPr>
+        <w:t xml:space="preserve"> </w:t>
+      </w:r>
+    </w:p>
+    <w:p>
+      <w:pPr>
+        <w:pStyle w:val="Listparagraf"/>
+        <w:numPr>
+          <w:ilvl w:val="0"/>
+          <w:numId w:val="17"/>
+        </w:numPr>
+        <w:spacing w:before="30" w:after="30"/>
+        <w:rPr>
+          <w:rFonts w:ascii="Times New Roman" w:hAnsi="Times New Roman" w:cs="Times New Roman"/>
+          <w:lang w:val="ro-RO"/>
+        </w:rPr>
+      </w:pPr>
+      <w:r>
+        <w:rPr>
+          <w:rFonts w:ascii="Times New Roman" w:hAnsi="Times New Roman" w:cs="Times New Roman"/>
+          <w:lang w:val="ro-RO"/>
+        </w:rPr>
+        <w:t xml:space="preserve">SECTOARE(1) ----------(N) ANIMALE </w:t>
+      </w:r>
+      <w:r>
+        <w:rPr>
+          <w:rFonts w:ascii="Times New Roman" w:hAnsi="Times New Roman" w:cs="Times New Roman"/>
+        </w:rPr>
+        <w:t>:</w:t>
+      </w:r>
+      <w:r>
+        <w:rPr>
+          <w:rFonts w:ascii="Times New Roman" w:hAnsi="Times New Roman" w:cs="Times New Roman"/>
+          <w:lang w:val="ro-RO"/>
+        </w:rPr>
+        <w:t xml:space="preserve"> Un sector conține mai multe animale. Un animal aparține unui singur sector. (1</w:t>
+      </w:r>
+      <w:r>
+        <w:rPr>
+          <w:rFonts w:ascii="Times New Roman" w:hAnsi="Times New Roman" w:cs="Times New Roman"/>
+        </w:rPr>
+        <w:t>:N)</w:t>
+      </w:r>
+      <w:r>
+        <w:rPr>
+          <w:rFonts w:ascii="Times New Roman" w:hAnsi="Times New Roman" w:cs="Times New Roman"/>
+          <w:lang w:val="ro-RO"/>
+        </w:rPr>
+        <w:t xml:space="preserve"> </w:t>
+      </w:r>
+    </w:p>
+    <w:p>
+      <w:pPr>
+        <w:pStyle w:val="Listparagraf"/>
+        <w:numPr>
+          <w:ilvl w:val="0"/>
+          <w:numId w:val="17"/>
+        </w:numPr>
+        <w:spacing w:before="30" w:after="30"/>
+        <w:rPr>
+          <w:rFonts w:ascii="Times New Roman" w:hAnsi="Times New Roman" w:cs="Times New Roman"/>
+          <w:lang w:val="ro-RO"/>
+        </w:rPr>
+      </w:pPr>
+      <w:r>
+        <w:rPr>
+          <w:rFonts w:ascii="Times New Roman" w:hAnsi="Times New Roman" w:cs="Times New Roman"/>
+          <w:lang w:val="ro-RO"/>
+        </w:rPr>
+        <w:t xml:space="preserve">ANIMALE(1) -----------(1)ADOPȚII </w:t>
+      </w:r>
+      <w:r>
+        <w:rPr>
+          <w:rFonts w:ascii="Times New Roman" w:hAnsi="Times New Roman" w:cs="Times New Roman"/>
+        </w:rPr>
+        <w:t xml:space="preserve">: </w:t>
+      </w:r>
+      <w:r>
+        <w:rPr>
+          <w:rFonts w:ascii="Times New Roman" w:hAnsi="Times New Roman" w:cs="Times New Roman"/>
+          <w:lang w:val="ro-RO"/>
+        </w:rPr>
+        <w:t>Un animal poate apărea în maxim un contract de adopție. (1</w:t>
+      </w:r>
+      <w:r>
+        <w:rPr>
+          <w:rFonts w:ascii="Times New Roman" w:hAnsi="Times New Roman" w:cs="Times New Roman"/>
+        </w:rPr>
+        <w:t>:</w:t>
+      </w:r>
+      <w:r>
+        <w:rPr>
+          <w:rFonts w:ascii="Times New Roman" w:hAnsi="Times New Roman" w:cs="Times New Roman"/>
+          <w:lang w:val="ro-RO"/>
+        </w:rPr>
+        <w:t>1 condiționat)</w:t>
+      </w:r>
+    </w:p>
+    <w:p>
+      <w:pPr>
+        <w:pStyle w:val="Listparagraf"/>
+        <w:numPr>
+          <w:ilvl w:val="0"/>
+          <w:numId w:val="17"/>
+        </w:numPr>
+        <w:spacing w:before="30" w:after="30"/>
+        <w:rPr>
+          <w:rFonts w:ascii="Times New Roman" w:hAnsi="Times New Roman" w:cs="Times New Roman"/>
+          <w:lang w:val="ro-RO"/>
+        </w:rPr>
+      </w:pPr>
+      <w:r>
+        <w:rPr>
+          <w:rFonts w:ascii="Times New Roman" w:hAnsi="Times New Roman" w:cs="Times New Roman"/>
+          <w:lang w:val="ro-RO"/>
+        </w:rPr>
+        <w:t>ADOPTATORI(1) ----------(N)ADOPȚII</w:t>
+      </w:r>
+      <w:r>
+        <w:rPr>
+          <w:rFonts w:ascii="Times New Roman" w:hAnsi="Times New Roman" w:cs="Times New Roman"/>
+        </w:rPr>
+        <w:t>:</w:t>
+      </w:r>
+      <w:r>
+        <w:rPr>
+          <w:rFonts w:ascii="Times New Roman" w:hAnsi="Times New Roman" w:cs="Times New Roman"/>
+          <w:lang w:val="ro-RO"/>
+        </w:rPr>
+        <w:t xml:space="preserve"> Un adoptator poate efectua mai multe adopții. (1</w:t>
+      </w:r>
+      <w:r>
+        <w:rPr>
+          <w:rFonts w:ascii="Times New Roman" w:hAnsi="Times New Roman" w:cs="Times New Roman"/>
+        </w:rPr>
+        <w:t>:</w:t>
+      </w:r>
+      <w:r>
+        <w:rPr>
+          <w:rFonts w:ascii="Times New Roman" w:hAnsi="Times New Roman" w:cs="Times New Roman"/>
+          <w:lang w:val="ro-RO"/>
+        </w:rPr>
+        <w:t>N)</w:t>
+      </w:r>
+    </w:p>
+    <w:p>
+      <w:pPr>
+        <w:pStyle w:val="Listparagraf"/>
+        <w:numPr>
+          <w:ilvl w:val="0"/>
+          <w:numId w:val="17"/>
+        </w:numPr>
+        <w:spacing w:before="30" w:after="30"/>
+        <w:rPr>
+          <w:rFonts w:ascii="Times New Roman" w:hAnsi="Times New Roman" w:cs="Times New Roman"/>
+          <w:lang w:val="ro-RO"/>
+        </w:rPr>
+      </w:pPr>
+      <w:r>
+        <w:rPr>
+          <w:rFonts w:ascii="Times New Roman" w:hAnsi="Times New Roman" w:cs="Times New Roman"/>
+          <w:lang w:val="ro-RO"/>
+        </w:rPr>
+        <w:t>ANIMALE</w:t>
+      </w:r>
+      <w:r>
+        <w:rPr>
+          <w:rFonts w:ascii="Times New Roman" w:hAnsi="Times New Roman" w:cs="Times New Roman"/>
+          <w:lang w:val="ro-RO"/>
+        </w:rPr>
+        <w:t xml:space="preserve"> (1) -------------(N) FIȘE</w:t>
+      </w:r>
+      <w:r>
+        <w:rPr>
+          <w:rFonts w:ascii="Times New Roman" w:hAnsi="Times New Roman" w:cs="Times New Roman"/>
+          <w:lang w:val="ro-RO"/>
+        </w:rPr>
+        <w:t xml:space="preserve">_MEDICALE </w:t>
+      </w:r>
+      <w:r>
+        <w:rPr>
+          <w:rFonts w:ascii="Times New Roman" w:hAnsi="Times New Roman" w:cs="Times New Roman"/>
+        </w:rPr>
+        <w:t>:</w:t>
+      </w:r>
+      <w:r>
+        <w:rPr>
+          <w:rFonts w:ascii="Times New Roman" w:hAnsi="Times New Roman" w:cs="Times New Roman"/>
+        </w:rPr>
+        <w:t xml:space="preserve"> Un animal </w:t>
+      </w:r>
+      <w:r>
+        <w:rPr>
+          <w:rFonts w:ascii="Times New Roman" w:hAnsi="Times New Roman" w:cs="Times New Roman"/>
+          <w:lang w:val="ro-RO"/>
+        </w:rPr>
+        <w:t>poate avea mai multe înregistrări medicale. (1</w:t>
+      </w:r>
+      <w:r>
+        <w:rPr>
+          <w:rFonts w:ascii="Times New Roman" w:hAnsi="Times New Roman" w:cs="Times New Roman"/>
+        </w:rPr>
+        <w:t>:</w:t>
+      </w:r>
+      <w:r>
+        <w:rPr>
+          <w:rFonts w:ascii="Times New Roman" w:hAnsi="Times New Roman" w:cs="Times New Roman"/>
+        </w:rPr>
+        <w:t>N</w:t>
+      </w:r>
+      <w:r>
+        <w:rPr>
+          <w:rFonts w:ascii="Times New Roman" w:hAnsi="Times New Roman" w:cs="Times New Roman"/>
+          <w:lang w:val="ro-RO"/>
+        </w:rPr>
+        <w:t>)</w:t>
       </w:r>
     </w:p>
     <w:p>
@@ -3523,6 +3268,232 @@
     </w:lvl>
   </w:abstractNum>
   <w:abstractNum w:abstractNumId="8" w15:restartNumberingAfterBreak="0">
+    <w:nsid w:val="57E41991"/>
+    <w:multiLevelType w:val="hybridMultilevel"/>
+    <w:tmpl w:val="209AFF64"/>
+    <w:lvl w:ilvl="0" w:tplc="0409000B">
+      <w:start w:val="1"/>
+      <w:numFmt w:val="bullet"/>
+      <w:lvlText w:val=""/>
+      <w:lvlJc w:val="left"/>
+      <w:pPr>
+        <w:ind w:left="1080" w:hanging="360"/>
+      </w:pPr>
+      <w:rPr>
+        <w:rFonts w:ascii="Wingdings" w:hAnsi="Wingdings" w:hint="default"/>
+      </w:rPr>
+    </w:lvl>
+    <w:lvl w:ilvl="1" w:tplc="04090003" w:tentative="1">
+      <w:start w:val="1"/>
+      <w:numFmt w:val="bullet"/>
+      <w:lvlText w:val="o"/>
+      <w:lvlJc w:val="left"/>
+      <w:pPr>
+        <w:ind w:left="1800" w:hanging="360"/>
+      </w:pPr>
+      <w:rPr>
+        <w:rFonts w:ascii="Courier New" w:hAnsi="Courier New" w:cs="Courier New" w:hint="default"/>
+      </w:rPr>
+    </w:lvl>
+    <w:lvl w:ilvl="2" w:tplc="04090005" w:tentative="1">
+      <w:start w:val="1"/>
+      <w:numFmt w:val="bullet"/>
+      <w:lvlText w:val=""/>
+      <w:lvlJc w:val="left"/>
+      <w:pPr>
+        <w:ind w:left="2520" w:hanging="360"/>
+      </w:pPr>
+      <w:rPr>
+        <w:rFonts w:ascii="Wingdings" w:hAnsi="Wingdings" w:hint="default"/>
+      </w:rPr>
+    </w:lvl>
+    <w:lvl w:ilvl="3" w:tplc="04090001" w:tentative="1">
+      <w:start w:val="1"/>
+      <w:numFmt w:val="bullet"/>
+      <w:lvlText w:val=""/>
+      <w:lvlJc w:val="left"/>
+      <w:pPr>
+        <w:ind w:left="3240" w:hanging="360"/>
+      </w:pPr>
+      <w:rPr>
+        <w:rFonts w:ascii="Symbol" w:hAnsi="Symbol" w:hint="default"/>
+      </w:rPr>
+    </w:lvl>
+    <w:lvl w:ilvl="4" w:tplc="04090003" w:tentative="1">
+      <w:start w:val="1"/>
+      <w:numFmt w:val="bullet"/>
+      <w:lvlText w:val="o"/>
+      <w:lvlJc w:val="left"/>
+      <w:pPr>
+        <w:ind w:left="3960" w:hanging="360"/>
+      </w:pPr>
+      <w:rPr>
+        <w:rFonts w:ascii="Courier New" w:hAnsi="Courier New" w:cs="Courier New" w:hint="default"/>
+      </w:rPr>
+    </w:lvl>
+    <w:lvl w:ilvl="5" w:tplc="04090005" w:tentative="1">
+      <w:start w:val="1"/>
+      <w:numFmt w:val="bullet"/>
+      <w:lvlText w:val=""/>
+      <w:lvlJc w:val="left"/>
+      <w:pPr>
+        <w:ind w:left="4680" w:hanging="360"/>
+      </w:pPr>
+      <w:rPr>
+        <w:rFonts w:ascii="Wingdings" w:hAnsi="Wingdings" w:hint="default"/>
+      </w:rPr>
+    </w:lvl>
+    <w:lvl w:ilvl="6" w:tplc="04090001" w:tentative="1">
+      <w:start w:val="1"/>
+      <w:numFmt w:val="bullet"/>
+      <w:lvlText w:val=""/>
+      <w:lvlJc w:val="left"/>
+      <w:pPr>
+        <w:ind w:left="5400" w:hanging="360"/>
+      </w:pPr>
+      <w:rPr>
+        <w:rFonts w:ascii="Symbol" w:hAnsi="Symbol" w:hint="default"/>
+      </w:rPr>
+    </w:lvl>
+    <w:lvl w:ilvl="7" w:tplc="04090003" w:tentative="1">
+      <w:start w:val="1"/>
+      <w:numFmt w:val="bullet"/>
+      <w:lvlText w:val="o"/>
+      <w:lvlJc w:val="left"/>
+      <w:pPr>
+        <w:ind w:left="6120" w:hanging="360"/>
+      </w:pPr>
+      <w:rPr>
+        <w:rFonts w:ascii="Courier New" w:hAnsi="Courier New" w:cs="Courier New" w:hint="default"/>
+      </w:rPr>
+    </w:lvl>
+    <w:lvl w:ilvl="8" w:tplc="04090005" w:tentative="1">
+      <w:start w:val="1"/>
+      <w:numFmt w:val="bullet"/>
+      <w:lvlText w:val=""/>
+      <w:lvlJc w:val="left"/>
+      <w:pPr>
+        <w:ind w:left="6840" w:hanging="360"/>
+      </w:pPr>
+      <w:rPr>
+        <w:rFonts w:ascii="Wingdings" w:hAnsi="Wingdings" w:hint="default"/>
+      </w:rPr>
+    </w:lvl>
+  </w:abstractNum>
+  <w:abstractNum w:abstractNumId="9" w15:restartNumberingAfterBreak="0">
+    <w:nsid w:val="5B947D61"/>
+    <w:multiLevelType w:val="hybridMultilevel"/>
+    <w:tmpl w:val="798ED6D2"/>
+    <w:lvl w:ilvl="0" w:tplc="0409000B">
+      <w:start w:val="1"/>
+      <w:numFmt w:val="bullet"/>
+      <w:lvlText w:val=""/>
+      <w:lvlJc w:val="left"/>
+      <w:pPr>
+        <w:ind w:left="720" w:hanging="360"/>
+      </w:pPr>
+      <w:rPr>
+        <w:rFonts w:ascii="Wingdings" w:hAnsi="Wingdings" w:hint="default"/>
+      </w:rPr>
+    </w:lvl>
+    <w:lvl w:ilvl="1" w:tplc="04090003" w:tentative="1">
+      <w:start w:val="1"/>
+      <w:numFmt w:val="bullet"/>
+      <w:lvlText w:val="o"/>
+      <w:lvlJc w:val="left"/>
+      <w:pPr>
+        <w:ind w:left="1440" w:hanging="360"/>
+      </w:pPr>
+      <w:rPr>
+        <w:rFonts w:ascii="Courier New" w:hAnsi="Courier New" w:cs="Courier New" w:hint="default"/>
+      </w:rPr>
+    </w:lvl>
+    <w:lvl w:ilvl="2" w:tplc="04090005" w:tentative="1">
+      <w:start w:val="1"/>
+      <w:numFmt w:val="bullet"/>
+      <w:lvlText w:val=""/>
+      <w:lvlJc w:val="left"/>
+      <w:pPr>
+        <w:ind w:left="2160" w:hanging="360"/>
+      </w:pPr>
+      <w:rPr>
+        <w:rFonts w:ascii="Wingdings" w:hAnsi="Wingdings" w:hint="default"/>
+      </w:rPr>
+    </w:lvl>
+    <w:lvl w:ilvl="3" w:tplc="04090001" w:tentative="1">
+      <w:start w:val="1"/>
+      <w:numFmt w:val="bullet"/>
+      <w:lvlText w:val=""/>
+      <w:lvlJc w:val="left"/>
+      <w:pPr>
+        <w:ind w:left="2880" w:hanging="360"/>
+      </w:pPr>
+      <w:rPr>
+        <w:rFonts w:ascii="Symbol" w:hAnsi="Symbol" w:hint="default"/>
+      </w:rPr>
+    </w:lvl>
+    <w:lvl w:ilvl="4" w:tplc="04090003" w:tentative="1">
+      <w:start w:val="1"/>
+      <w:numFmt w:val="bullet"/>
+      <w:lvlText w:val="o"/>
+      <w:lvlJc w:val="left"/>
+      <w:pPr>
+        <w:ind w:left="3600" w:hanging="360"/>
+      </w:pPr>
+      <w:rPr>
+        <w:rFonts w:ascii="Courier New" w:hAnsi="Courier New" w:cs="Courier New" w:hint="default"/>
+      </w:rPr>
+    </w:lvl>
+    <w:lvl w:ilvl="5" w:tplc="04090005" w:tentative="1">
+      <w:start w:val="1"/>
+      <w:numFmt w:val="bullet"/>
+      <w:lvlText w:val=""/>
+      <w:lvlJc w:val="left"/>
+      <w:pPr>
+        <w:ind w:left="4320" w:hanging="360"/>
+      </w:pPr>
+      <w:rPr>
+        <w:rFonts w:ascii="Wingdings" w:hAnsi="Wingdings" w:hint="default"/>
+      </w:rPr>
+    </w:lvl>
+    <w:lvl w:ilvl="6" w:tplc="04090001" w:tentative="1">
+      <w:start w:val="1"/>
+      <w:numFmt w:val="bullet"/>
+      <w:lvlText w:val=""/>
+      <w:lvlJc w:val="left"/>
+      <w:pPr>
+        <w:ind w:left="5040" w:hanging="360"/>
+      </w:pPr>
+      <w:rPr>
+        <w:rFonts w:ascii="Symbol" w:hAnsi="Symbol" w:hint="default"/>
+      </w:rPr>
+    </w:lvl>
+    <w:lvl w:ilvl="7" w:tplc="04090003" w:tentative="1">
+      <w:start w:val="1"/>
+      <w:numFmt w:val="bullet"/>
+      <w:lvlText w:val="o"/>
+      <w:lvlJc w:val="left"/>
+      <w:pPr>
+        <w:ind w:left="5760" w:hanging="360"/>
+      </w:pPr>
+      <w:rPr>
+        <w:rFonts w:ascii="Courier New" w:hAnsi="Courier New" w:cs="Courier New" w:hint="default"/>
+      </w:rPr>
+    </w:lvl>
+    <w:lvl w:ilvl="8" w:tplc="04090005" w:tentative="1">
+      <w:start w:val="1"/>
+      <w:numFmt w:val="bullet"/>
+      <w:lvlText w:val=""/>
+      <w:lvlJc w:val="left"/>
+      <w:pPr>
+        <w:ind w:left="6480" w:hanging="360"/>
+      </w:pPr>
+      <w:rPr>
+        <w:rFonts w:ascii="Wingdings" w:hAnsi="Wingdings" w:hint="default"/>
+      </w:rPr>
+    </w:lvl>
+  </w:abstractNum>
+  <w:abstractNum w:abstractNumId="10" w15:restartNumberingAfterBreak="0">
     <w:nsid w:val="5D596014"/>
     <w:multiLevelType w:val="hybridMultilevel"/>
     <w:tmpl w:val="39888FDA"/>
@@ -3635,7 +3606,7 @@
       </w:rPr>
     </w:lvl>
   </w:abstractNum>
-  <w:abstractNum w:abstractNumId="9" w15:restartNumberingAfterBreak="0">
+  <w:abstractNum w:abstractNumId="11" w15:restartNumberingAfterBreak="0">
     <w:nsid w:val="656C20FA"/>
     <w:multiLevelType w:val="hybridMultilevel"/>
     <w:tmpl w:val="BCA45798"/>
@@ -3748,7 +3719,7 @@
       </w:rPr>
     </w:lvl>
   </w:abstractNum>
-  <w:abstractNum w:abstractNumId="10" w15:restartNumberingAfterBreak="0">
+  <w:abstractNum w:abstractNumId="12" w15:restartNumberingAfterBreak="0">
     <w:nsid w:val="66CA1BAC"/>
     <w:multiLevelType w:val="hybridMultilevel"/>
     <w:tmpl w:val="967C80B2"/>
@@ -3837,7 +3808,7 @@
       </w:pPr>
     </w:lvl>
   </w:abstractNum>
-  <w:abstractNum w:abstractNumId="11" w15:restartNumberingAfterBreak="0">
+  <w:abstractNum w:abstractNumId="13" w15:restartNumberingAfterBreak="0">
     <w:nsid w:val="6C584A9B"/>
     <w:multiLevelType w:val="hybridMultilevel"/>
     <w:tmpl w:val="9C1C47C0"/>
@@ -3950,7 +3921,120 @@
       </w:rPr>
     </w:lvl>
   </w:abstractNum>
-  <w:abstractNum w:abstractNumId="12" w15:restartNumberingAfterBreak="0">
+  <w:abstractNum w:abstractNumId="14" w15:restartNumberingAfterBreak="0">
+    <w:nsid w:val="72D230DE"/>
+    <w:multiLevelType w:val="hybridMultilevel"/>
+    <w:tmpl w:val="05FE1D30"/>
+    <w:lvl w:ilvl="0" w:tplc="0409000B">
+      <w:start w:val="1"/>
+      <w:numFmt w:val="bullet"/>
+      <w:lvlText w:val=""/>
+      <w:lvlJc w:val="left"/>
+      <w:pPr>
+        <w:ind w:left="720" w:hanging="360"/>
+      </w:pPr>
+      <w:rPr>
+        <w:rFonts w:ascii="Wingdings" w:hAnsi="Wingdings" w:hint="default"/>
+      </w:rPr>
+    </w:lvl>
+    <w:lvl w:ilvl="1" w:tplc="04090003" w:tentative="1">
+      <w:start w:val="1"/>
+      <w:numFmt w:val="bullet"/>
+      <w:lvlText w:val="o"/>
+      <w:lvlJc w:val="left"/>
+      <w:pPr>
+        <w:ind w:left="1440" w:hanging="360"/>
+      </w:pPr>
+      <w:rPr>
+        <w:rFonts w:ascii="Courier New" w:hAnsi="Courier New" w:cs="Courier New" w:hint="default"/>
+      </w:rPr>
+    </w:lvl>
+    <w:lvl w:ilvl="2" w:tplc="04090005" w:tentative="1">
+      <w:start w:val="1"/>
+      <w:numFmt w:val="bullet"/>
+      <w:lvlText w:val=""/>
+      <w:lvlJc w:val="left"/>
+      <w:pPr>
+        <w:ind w:left="2160" w:hanging="360"/>
+      </w:pPr>
+      <w:rPr>
+        <w:rFonts w:ascii="Wingdings" w:hAnsi="Wingdings" w:hint="default"/>
+      </w:rPr>
+    </w:lvl>
+    <w:lvl w:ilvl="3" w:tplc="04090001" w:tentative="1">
+      <w:start w:val="1"/>
+      <w:numFmt w:val="bullet"/>
+      <w:lvlText w:val=""/>
+      <w:lvlJc w:val="left"/>
+      <w:pPr>
+        <w:ind w:left="2880" w:hanging="360"/>
+      </w:pPr>
+      <w:rPr>
+        <w:rFonts w:ascii="Symbol" w:hAnsi="Symbol" w:hint="default"/>
+      </w:rPr>
+    </w:lvl>
+    <w:lvl w:ilvl="4" w:tplc="04090003" w:tentative="1">
+      <w:start w:val="1"/>
+      <w:numFmt w:val="bullet"/>
+      <w:lvlText w:val="o"/>
+      <w:lvlJc w:val="left"/>
+      <w:pPr>
+        <w:ind w:left="3600" w:hanging="360"/>
+      </w:pPr>
+      <w:rPr>
+        <w:rFonts w:ascii="Courier New" w:hAnsi="Courier New" w:cs="Courier New" w:hint="default"/>
+      </w:rPr>
+    </w:lvl>
+    <w:lvl w:ilvl="5" w:tplc="04090005" w:tentative="1">
+      <w:start w:val="1"/>
+      <w:numFmt w:val="bullet"/>
+      <w:lvlText w:val=""/>
+      <w:lvlJc w:val="left"/>
+      <w:pPr>
+        <w:ind w:left="4320" w:hanging="360"/>
+      </w:pPr>
+      <w:rPr>
+        <w:rFonts w:ascii="Wingdings" w:hAnsi="Wingdings" w:hint="default"/>
+      </w:rPr>
+    </w:lvl>
+    <w:lvl w:ilvl="6" w:tplc="04090001" w:tentative="1">
+      <w:start w:val="1"/>
+      <w:numFmt w:val="bullet"/>
+      <w:lvlText w:val=""/>
+      <w:lvlJc w:val="left"/>
+      <w:pPr>
+        <w:ind w:left="5040" w:hanging="360"/>
+      </w:pPr>
+      <w:rPr>
+        <w:rFonts w:ascii="Symbol" w:hAnsi="Symbol" w:hint="default"/>
+      </w:rPr>
+    </w:lvl>
+    <w:lvl w:ilvl="7" w:tplc="04090003" w:tentative="1">
+      <w:start w:val="1"/>
+      <w:numFmt w:val="bullet"/>
+      <w:lvlText w:val="o"/>
+      <w:lvlJc w:val="left"/>
+      <w:pPr>
+        <w:ind w:left="5760" w:hanging="360"/>
+      </w:pPr>
+      <w:rPr>
+        <w:rFonts w:ascii="Courier New" w:hAnsi="Courier New" w:cs="Courier New" w:hint="default"/>
+      </w:rPr>
+    </w:lvl>
+    <w:lvl w:ilvl="8" w:tplc="04090005" w:tentative="1">
+      <w:start w:val="1"/>
+      <w:numFmt w:val="bullet"/>
+      <w:lvlText w:val=""/>
+      <w:lvlJc w:val="left"/>
+      <w:pPr>
+        <w:ind w:left="6480" w:hanging="360"/>
+      </w:pPr>
+      <w:rPr>
+        <w:rFonts w:ascii="Wingdings" w:hAnsi="Wingdings" w:hint="default"/>
+      </w:rPr>
+    </w:lvl>
+  </w:abstractNum>
+  <w:abstractNum w:abstractNumId="15" w15:restartNumberingAfterBreak="0">
     <w:nsid w:val="7E2F33F0"/>
     <w:multiLevelType w:val="hybridMultilevel"/>
     <w:tmpl w:val="057EF3C2"/>
@@ -4036,7 +4120,7 @@
       </w:pPr>
     </w:lvl>
   </w:abstractNum>
-  <w:abstractNum w:abstractNumId="13" w15:restartNumberingAfterBreak="0">
+  <w:abstractNum w:abstractNumId="16" w15:restartNumberingAfterBreak="0">
     <w:nsid w:val="7F8F577E"/>
     <w:multiLevelType w:val="hybridMultilevel"/>
     <w:tmpl w:val="A28431F6"/>
@@ -4150,16 +4234,16 @@
     </w:lvl>
   </w:abstractNum>
   <w:num w:numId="1" w16cid:durableId="591860462">
-    <w:abstractNumId w:val="10"/>
+    <w:abstractNumId w:val="12"/>
   </w:num>
   <w:num w:numId="2" w16cid:durableId="1453590607">
-    <w:abstractNumId w:val="13"/>
+    <w:abstractNumId w:val="16"/>
   </w:num>
   <w:num w:numId="3" w16cid:durableId="537549484">
     <w:abstractNumId w:val="1"/>
   </w:num>
   <w:num w:numId="4" w16cid:durableId="1868442318">
-    <w:abstractNumId w:val="9"/>
+    <w:abstractNumId w:val="11"/>
   </w:num>
   <w:num w:numId="5" w16cid:durableId="2001997932">
     <w:abstractNumId w:val="0"/>
@@ -4174,13 +4258,13 @@
     <w:abstractNumId w:val="7"/>
   </w:num>
   <w:num w:numId="9" w16cid:durableId="1675231607">
-    <w:abstractNumId w:val="8"/>
+    <w:abstractNumId w:val="10"/>
   </w:num>
   <w:num w:numId="10" w16cid:durableId="1398288142">
-    <w:abstractNumId w:val="11"/>
+    <w:abstractNumId w:val="13"/>
   </w:num>
   <w:num w:numId="11" w16cid:durableId="1211917104">
-    <w:abstractNumId w:val="12"/>
+    <w:abstractNumId w:val="15"/>
   </w:num>
   <w:num w:numId="12" w16cid:durableId="1517621323">
     <w:abstractNumId w:val="2"/>
@@ -4190,6 +4274,15 @@
   </w:num>
   <w:num w:numId="14" w16cid:durableId="1913811560">
     <w:abstractNumId w:val="6"/>
+  </w:num>
+  <w:num w:numId="15" w16cid:durableId="2082632069">
+    <w:abstractNumId w:val="9"/>
+  </w:num>
+  <w:num w:numId="16" w16cid:durableId="1459445538">
+    <w:abstractNumId w:val="8"/>
+  </w:num>
+  <w:num w:numId="17" w16cid:durableId="1368218539">
+    <w:abstractNumId w:val="14"/>
   </w:num>
 </w:numbering>
 </file>

</xml_diff>